<commit_message>
fix(SELLL-Engine): regenerate ICP + TAM Word docs - remove garbled characters
PowerShell encoding bug corrupted the previous build script (UTF-8 written
back as CP1252), causing em dashes, stars, and emoji to appear as mojibake
in both docs. Rebuilt from a clean ASCII-safe Python script.

Co-Authored-By: Claude Sonnet 4.6 <noreply@anthropic.com>
</commit_message>
<xml_diff>
--- a/SELLL-Engine/SELLL-Ideal-Customer-Profile.docx
+++ b/SELLL-Engine/SELLL-Ideal-Customer-Profile.docx
@@ -19,7 +19,7 @@
               <a:graphicData uri="http://schemas.openxmlformats.org/drawingml/2006/picture">
                 <pic:pic>
                   <pic:nvPicPr>
-                    <pic:cNvPr id="0" name="selll_logo.png"/>
+                    <pic:cNvPr id="0" name="selll_logo_clean.png"/>
                     <pic:cNvPicPr/>
                   </pic:nvPicPr>
                   <pic:blipFill>
@@ -44,7 +44,6 @@
     </w:p>
     <w:p>
       <w:pPr>
-        <w:spacing w:before="200"/>
         <w:jc w:val="center"/>
       </w:pPr>
       <w:r>
@@ -66,7 +65,7 @@
           <w:color w:val="E8B830"/>
           <w:sz w:val="22"/>
         </w:rPr>
-        <w:t>Signal-triggered Â· AI-orchestrated Â· B2B Revenue Engine</w:t>
+        <w:t>Signal-triggered  |  AI-orchestrated  |  B2B Revenue Engine</w:t>
       </w:r>
     </w:p>
     <w:p>
@@ -79,7 +78,7 @@
           <w:color w:val="888888"/>
           <w:sz w:val="18"/>
         </w:rPr>
-        <w:t>Generated: June 2026  |  Confidential â€” Internal Use</w:t>
+        <w:t>Generated: June 2026  |  Confidential - Internal Use</w:t>
       </w:r>
     </w:p>
     <w:p/>
@@ -109,7 +108,7 @@
           <w:color w:val="1A1A2E"/>
           <w:sz w:val="20"/>
         </w:rPr>
-        <w:t>SELLL's ideal customer is a B2B company with a product people want to buy but no system to find them predictably. They're generating some revenue â€” proof the product works â€” but pipeline comes from relationships, referrals, or luck.</w:t>
+        <w:t>SELLL's ideal customer is a B2B company with a product people want to buy but no system to find them predictably. They're generating some revenue - proof the product works - but pipeline comes from relationships, referrals, or luck.</w:t>
       </w:r>
     </w:p>
     <w:p>
@@ -122,7 +121,7 @@
           <w:color w:val="1A1A2E"/>
           <w:sz w:val="20"/>
         </w:rPr>
-        <w:t>The sweet spot is 10â€“100 employees, $500Kâ€“$10M ARR, selling a B2B product or service with an ACV of $5Kâ€“$100K. They're past the 'will anyone pay for this' question. They're stuck on 'how do we get in front of the right 50 people every week without the founder doing it manually.'</w:t>
+        <w:t>The sweet spot is 10-100 employees, $500K-$10M ARR, selling a B2B product or service with an ACV of $5K-$100K. They are past the 'will anyone pay for this' question. They are stuck on 'how do we get in front of the right 50 people every week without the founder doing it manually.'</w:t>
       </w:r>
     </w:p>
     <w:p>
@@ -304,7 +303,7 @@
                 <w:color w:val="1A1A2E"/>
                 <w:sz w:val="18"/>
               </w:rPr>
-              <w:t>S1 â€” Solo / Micro</w:t>
+              <w:t>S1 - Solo / Micro</w:t>
             </w:r>
           </w:p>
         </w:tc>
@@ -320,7 +319,7 @@
                 <w:color w:val="1A1A2E"/>
                 <w:sz w:val="18"/>
               </w:rPr>
-              <w:t>1â€“10</w:t>
+              <w:t>1-10</w:t>
             </w:r>
           </w:p>
         </w:tc>
@@ -336,7 +335,7 @@
                 <w:color w:val="1A1A2E"/>
                 <w:sz w:val="18"/>
               </w:rPr>
-              <w:t>$0â€“$1M</w:t>
+              <w:t>$0-$1M</w:t>
             </w:r>
           </w:p>
         </w:tc>
@@ -402,7 +401,7 @@
                 <w:color w:val="1A1A2E"/>
                 <w:sz w:val="18"/>
               </w:rPr>
-              <w:t>S2 â€” Growth No-Sales</w:t>
+              <w:t>S2 - Growth No-Sales</w:t>
             </w:r>
           </w:p>
         </w:tc>
@@ -418,7 +417,7 @@
                 <w:color w:val="1A1A2E"/>
                 <w:sz w:val="18"/>
               </w:rPr>
-              <w:t>10â€“50</w:t>
+              <w:t>10-50</w:t>
             </w:r>
           </w:p>
         </w:tc>
@@ -434,7 +433,7 @@
                 <w:color w:val="1A1A2E"/>
                 <w:sz w:val="18"/>
               </w:rPr>
-              <w:t>$500Kâ€“$5M</w:t>
+              <w:t>$500K-$5M</w:t>
             </w:r>
           </w:p>
         </w:tc>
@@ -482,7 +481,7 @@
                 <w:color w:val="1A1A2E"/>
                 <w:sz w:val="18"/>
               </w:rPr>
-              <w:t>â˜… Best Fit</w:t>
+              <w:t>BEST FIT</w:t>
             </w:r>
           </w:p>
         </w:tc>
@@ -500,7 +499,7 @@
                 <w:color w:val="1A1A2E"/>
                 <w:sz w:val="18"/>
               </w:rPr>
-              <w:t>S3 â€” SMB Scaling</w:t>
+              <w:t>S3 - SMB Scaling</w:t>
             </w:r>
           </w:p>
         </w:tc>
@@ -516,7 +515,7 @@
                 <w:color w:val="1A1A2E"/>
                 <w:sz w:val="18"/>
               </w:rPr>
-              <w:t>50â€“100</w:t>
+              <w:t>50-100</w:t>
             </w:r>
           </w:p>
         </w:tc>
@@ -532,7 +531,7 @@
                 <w:color w:val="1A1A2E"/>
                 <w:sz w:val="18"/>
               </w:rPr>
-              <w:t>$3Mâ€“$15M</w:t>
+              <w:t>$3M-$15M</w:t>
             </w:r>
           </w:p>
         </w:tc>
@@ -598,7 +597,7 @@
                 <w:color w:val="1A1A2E"/>
                 <w:sz w:val="18"/>
               </w:rPr>
-              <w:t>S4 â€” Mid-Market</w:t>
+              <w:t>S4 - Mid-Market</w:t>
             </w:r>
           </w:p>
         </w:tc>
@@ -614,7 +613,7 @@
                 <w:color w:val="1A1A2E"/>
                 <w:sz w:val="18"/>
               </w:rPr>
-              <w:t>100â€“200</w:t>
+              <w:t>100-200</w:t>
             </w:r>
           </w:p>
         </w:tc>
@@ -630,7 +629,7 @@
                 <w:color w:val="1A1A2E"/>
                 <w:sz w:val="18"/>
               </w:rPr>
-              <w:t>$8Mâ€“$30M</w:t>
+              <w:t>$8M-$30M</w:t>
             </w:r>
           </w:p>
         </w:tc>
@@ -825,7 +824,7 @@
                 <w:color w:val="1A1A2E"/>
                 <w:sz w:val="18"/>
               </w:rPr>
-              <w:t>10â€“150 (core: 15â€“80)</w:t>
+              <w:t>10-150 (core: 15-80)</w:t>
             </w:r>
           </w:p>
         </w:tc>
@@ -891,7 +890,7 @@
                 <w:color w:val="1A1A2E"/>
                 <w:sz w:val="18"/>
               </w:rPr>
-              <w:t>$500Kâ€“$20M</w:t>
+              <w:t>$500K-$20M</w:t>
             </w:r>
           </w:p>
         </w:tc>
@@ -1023,7 +1022,7 @@
                 <w:color w:val="1A1A2E"/>
                 <w:sz w:val="18"/>
               </w:rPr>
-              <w:t>$5Kâ€“$120K/year</w:t>
+              <w:t>$5K-$120K/year</w:t>
             </w:r>
           </w:p>
         </w:tc>
@@ -1089,7 +1088,7 @@
                 <w:color w:val="1A1A2E"/>
                 <w:sz w:val="18"/>
               </w:rPr>
-              <w:t>Post-seed â†’ Series B</w:t>
+              <w:t>Post-seed to Series B</w:t>
             </w:r>
           </w:p>
         </w:tc>
@@ -1121,7 +1120,7 @@
                 <w:color w:val="1A1A2E"/>
                 <w:sz w:val="18"/>
               </w:rPr>
-              <w:t>Pre-seed (no budget); C+ (team built)</w:t>
+              <w:t>Pre-seed (no budget); Series C+ (team built)</w:t>
             </w:r>
           </w:p>
         </w:tc>
@@ -1237,7 +1236,7 @@
                 <w:color w:val="1A1A2E"/>
                 <w:sz w:val="18"/>
               </w:rPr>
-              <w:t>Product iteration, defined ICP, paying clients</w:t>
+              <w:t>Has product iteration, paying customers</w:t>
             </w:r>
           </w:p>
         </w:tc>
@@ -1328,7 +1327,7 @@
     <w:p/>
     <w:p>
       <w:pPr>
-        <w:spacing w:before="200" w:after="100"/>
+        <w:spacing w:before="200" w:after="80"/>
       </w:pPr>
       <w:r>
         <w:rPr>
@@ -1935,7 +1934,7 @@
                 <w:color w:val="1A1A2E"/>
                 <w:sz w:val="18"/>
               </w:rPr>
-              <w:t>Apollo free, Instantly, Lemlist (not working)</w:t>
+              <w:t>Apollo free, Instantly, Lemlist (not working well)</w:t>
             </w:r>
           </w:p>
         </w:tc>
@@ -2168,7 +2167,7 @@
           <w:color w:val="1A1A2E"/>
           <w:sz w:val="20"/>
         </w:rPr>
-        <w:t>Technical sophistication: 2â€“3 out of 5. They use SaaS tools but have not built a custom signal/data layer. No dedicated RevOps function.</w:t>
+        <w:t>Technical sophistication: 2-3 out of 5. Uses SaaS tools but has not built a signal/data layer. No dedicated RevOps function.</w:t>
       </w:r>
     </w:p>
     <w:p>
@@ -2306,7 +2305,7 @@
                 <w:color w:val="1A1A2E"/>
                 <w:sz w:val="18"/>
               </w:rPr>
-              <w:t>ðŸ”´ Immediate</w:t>
+              <w:t>IMMEDIATE</w:t>
             </w:r>
           </w:p>
         </w:tc>
@@ -2356,7 +2355,7 @@
                 <w:color w:val="1A1A2E"/>
                 <w:sz w:val="18"/>
               </w:rPr>
-              <w:t>ðŸ”´ Immediate</w:t>
+              <w:t>IMMEDIATE</w:t>
             </w:r>
           </w:p>
         </w:tc>
@@ -2374,7 +2373,7 @@
                 <w:color w:val="1A1A2E"/>
                 <w:sz w:val="18"/>
               </w:rPr>
-              <w:t>Founder LinkedIn post â€” sales struggles</w:t>
+              <w:t>Founder LinkedIn post - sales struggles</w:t>
             </w:r>
           </w:p>
         </w:tc>
@@ -2406,7 +2405,7 @@
                 <w:color w:val="1A1A2E"/>
                 <w:sz w:val="18"/>
               </w:rPr>
-              <w:t>ðŸ”´ Immediate</w:t>
+              <w:t>IMMEDIATE</w:t>
             </w:r>
           </w:p>
         </w:tc>
@@ -2456,7 +2455,7 @@
                 <w:color w:val="1A1A2E"/>
                 <w:sz w:val="18"/>
               </w:rPr>
-              <w:t>ðŸ”´ Immediate</w:t>
+              <w:t>IMMEDIATE</w:t>
             </w:r>
           </w:p>
         </w:tc>
@@ -2474,7 +2473,7 @@
                 <w:color w:val="1A1A2E"/>
                 <w:sz w:val="18"/>
               </w:rPr>
-              <w:t>Funding round Seedâ€“Series B</w:t>
+              <w:t>Funding round Seed-Series B</w:t>
             </w:r>
           </w:p>
         </w:tc>
@@ -2506,7 +2505,7 @@
                 <w:color w:val="1A1A2E"/>
                 <w:sz w:val="18"/>
               </w:rPr>
-              <w:t>ðŸŸ  This week</w:t>
+              <w:t>THIS WEEK</w:t>
             </w:r>
           </w:p>
         </w:tc>
@@ -2556,7 +2555,7 @@
                 <w:color w:val="1A1A2E"/>
                 <w:sz w:val="18"/>
               </w:rPr>
-              <w:t>ðŸŸ  This week</w:t>
+              <w:t>THIS WEEK</w:t>
             </w:r>
           </w:p>
         </w:tc>
@@ -2574,7 +2573,7 @@
                 <w:color w:val="1A1A2E"/>
                 <w:sz w:val="18"/>
               </w:rPr>
-              <w:t>0â€“1 case studies on website</w:t>
+              <w:t>0-1 case studies on website</w:t>
             </w:r>
           </w:p>
         </w:tc>
@@ -2606,7 +2605,7 @@
                 <w:color w:val="1A1A2E"/>
                 <w:sz w:val="18"/>
               </w:rPr>
-              <w:t>ðŸŸ¡ This month</w:t>
+              <w:t>THIS MONTH</w:t>
             </w:r>
           </w:p>
         </w:tc>
@@ -2656,7 +2655,7 @@
                 <w:color w:val="1A1A2E"/>
                 <w:sz w:val="18"/>
               </w:rPr>
-              <w:t>ðŸŸ¡ This month</w:t>
+              <w:t>THIS MONTH</w:t>
             </w:r>
           </w:p>
         </w:tc>
@@ -2681,7 +2680,7 @@
     </w:p>
     <w:p>
       <w:pPr>
-        <w:spacing w:before="200" w:after="100"/>
+        <w:spacing w:before="200" w:after="80"/>
       </w:pPr>
       <w:r>
         <w:rPr>
@@ -2689,7 +2688,7 @@
           <w:color w:val="1A1A2E"/>
           <w:sz w:val="21"/>
         </w:rPr>
-        <w:t>Pain 1 â€” No Predictable Pipeline</w:t>
+        <w:t>Pain 1 - No Predictable Pipeline</w:t>
       </w:r>
     </w:p>
     <w:tbl>
@@ -2797,7 +2796,7 @@
         <w:rPr>
           <w:sz w:val="20"/>
         </w:rPr>
-        <w:t>Revenue is lumpy. The founder can't predict next quarter within 30%. Board asking questions.</w:t>
+        <w:t>Revenue is lumpy. The founder cannot predict next quarter within 30%. Board asking questions.</w:t>
       </w:r>
     </w:p>
     <w:p>
@@ -2818,12 +2817,12 @@
           <w:color w:val="1A1A2E"/>
           <w:sz w:val="20"/>
         </w:rPr>
-        <w:t>'You can't predict what you don't systematise. We build the system that makes pipeline a number, not a prayer.'</w:t>
+        <w:t>'You cannot predict what you don't systematise. We build the system that makes pipeline a number, not a prayer.'</w:t>
       </w:r>
     </w:p>
     <w:p>
       <w:pPr>
-        <w:spacing w:before="200" w:after="100"/>
+        <w:spacing w:before="200" w:after="80"/>
       </w:pPr>
       <w:r>
         <w:rPr>
@@ -2831,7 +2830,7 @@
           <w:color w:val="1A1A2E"/>
           <w:sz w:val="21"/>
         </w:rPr>
-        <w:t>Pain 2 â€” Founder Closing Every Deal</w:t>
+        <w:t>Pain 2 - Founder Closing Every Deal</w:t>
       </w:r>
     </w:p>
     <w:tbl>
@@ -2960,12 +2959,12 @@
           <w:color w:val="1A1A2E"/>
           <w:sz w:val="20"/>
         </w:rPr>
-        <w:t>'The problem isn't that you're a bad delegator. There's no documented system to hand over. We build that system.'</w:t>
+        <w:t>'The problem is not that you're a bad delegator. There is no documented system to hand over. We build that system.'</w:t>
       </w:r>
     </w:p>
     <w:p>
       <w:pPr>
-        <w:spacing w:before="200" w:after="100"/>
+        <w:spacing w:before="200" w:after="80"/>
       </w:pPr>
       <w:r>
         <w:rPr>
@@ -2973,7 +2972,7 @@
           <w:color w:val="1A1A2E"/>
           <w:sz w:val="21"/>
         </w:rPr>
-        <w:t>Pain 3 â€” Outbound Tried, Got Nothing</w:t>
+        <w:t>Pain 3 - Outbound Tried, Got Nothing</w:t>
       </w:r>
     </w:p>
     <w:tbl>
@@ -3107,7 +3106,7 @@
     </w:p>
     <w:p>
       <w:pPr>
-        <w:spacing w:before="200" w:after="100"/>
+        <w:spacing w:before="200" w:after="80"/>
       </w:pPr>
       <w:r>
         <w:rPr>
@@ -3115,7 +3114,7 @@
           <w:color w:val="1A1A2E"/>
           <w:sz w:val="21"/>
         </w:rPr>
-        <w:t>Pain 4 â€” Can't Hire Fast Enough</w:t>
+        <w:t>Pain 4 - Can't Hire Fast Enough</w:t>
       </w:r>
     </w:p>
     <w:tbl>
@@ -3249,7 +3248,7 @@
     </w:p>
     <w:p>
       <w:pPr>
-        <w:spacing w:before="200" w:after="100"/>
+        <w:spacing w:before="200" w:after="80"/>
       </w:pPr>
       <w:r>
         <w:rPr>
@@ -3257,7 +3256,7 @@
           <w:color w:val="1A1A2E"/>
           <w:sz w:val="21"/>
         </w:rPr>
-        <w:t>Pain 5 â€” No Intelligence Layer</w:t>
+        <w:t>Pain 5 - No Intelligence Layer</w:t>
       </w:r>
     </w:p>
     <w:tbl>
@@ -3365,7 +3364,7 @@
         <w:rPr>
           <w:sz w:val="20"/>
         </w:rPr>
-        <w:t>Sequences exist. CRM exists. Apollo exists. But no one knows who to call TODAY or why. Reps are guessing.</w:t>
+        <w:t>Sequences exist. CRM exists. Apollo exists. But no one knows who to call TODAY or why.</w:t>
       </w:r>
     </w:p>
     <w:p>
@@ -3386,7 +3385,7 @@
           <w:color w:val="1A1A2E"/>
           <w:sz w:val="20"/>
         </w:rPr>
-        <w:t>'The stack doesn't need more tools. It needs a brain. Signal-triggered outreach is 3â€“5x the reply rate of calendar-triggered sequences.'</w:t>
+        <w:t>'The stack doesn't need more tools. It needs a brain. Signal-triggered outreach is 3-5x the reply rate of calendar-triggered sequences.'</w:t>
       </w:r>
     </w:p>
     <w:p>
@@ -3534,7 +3533,7 @@
                 <w:color w:val="1A1A2E"/>
                 <w:sz w:val="18"/>
               </w:rPr>
-              <w:t>S1 (1â€“10)</w:t>
+              <w:t>S1 (1-10)</w:t>
             </w:r>
           </w:p>
         </w:tc>
@@ -3550,7 +3549,7 @@
                 <w:color w:val="1A1A2E"/>
                 <w:sz w:val="18"/>
               </w:rPr>
-              <w:t>$1Kâ€“$3.5K/mo</w:t>
+              <w:t>$1K-$3.5K/mo</w:t>
             </w:r>
           </w:p>
         </w:tc>
@@ -3566,7 +3565,7 @@
                 <w:color w:val="1A1A2E"/>
                 <w:sz w:val="18"/>
               </w:rPr>
-              <w:t>$12Kâ€“$42K</w:t>
+              <w:t>$12K-$42K</w:t>
             </w:r>
           </w:p>
         </w:tc>
@@ -3582,7 +3581,7 @@
                 <w:color w:val="1A1A2E"/>
                 <w:sz w:val="18"/>
               </w:rPr>
-              <w:t>$3Kâ€“$5K/mo</w:t>
+              <w:t>$3K-$5K/mo</w:t>
             </w:r>
           </w:p>
         </w:tc>
@@ -3616,7 +3615,7 @@
                 <w:color w:val="1A1A2E"/>
                 <w:sz w:val="18"/>
               </w:rPr>
-              <w:t>S2 (10â€“50)</w:t>
+              <w:t>S2 (10-50)</w:t>
             </w:r>
           </w:p>
         </w:tc>
@@ -3632,7 +3631,7 @@
                 <w:color w:val="1A1A2E"/>
                 <w:sz w:val="18"/>
               </w:rPr>
-              <w:t>$3Kâ€“$8K/mo</w:t>
+              <w:t>$3K-$8K/mo</w:t>
             </w:r>
           </w:p>
         </w:tc>
@@ -3648,7 +3647,7 @@
                 <w:color w:val="1A1A2E"/>
                 <w:sz w:val="18"/>
               </w:rPr>
-              <w:t>$36Kâ€“$96K</w:t>
+              <w:t>$36K-$96K</w:t>
             </w:r>
           </w:p>
         </w:tc>
@@ -3664,7 +3663,7 @@
                 <w:color w:val="1A1A2E"/>
                 <w:sz w:val="18"/>
               </w:rPr>
-              <w:t>$5Kâ€“$8K/mo</w:t>
+              <w:t>$5K-$8K/mo</w:t>
             </w:r>
           </w:p>
         </w:tc>
@@ -3698,7 +3697,7 @@
                 <w:color w:val="1A1A2E"/>
                 <w:sz w:val="18"/>
               </w:rPr>
-              <w:t>S3 (50â€“100)</w:t>
+              <w:t>S3 (50-100)</w:t>
             </w:r>
           </w:p>
         </w:tc>
@@ -3714,7 +3713,7 @@
                 <w:color w:val="1A1A2E"/>
                 <w:sz w:val="18"/>
               </w:rPr>
-              <w:t>$6Kâ€“$15K/mo</w:t>
+              <w:t>$6K-$15K/mo</w:t>
             </w:r>
           </w:p>
         </w:tc>
@@ -3730,7 +3729,7 @@
                 <w:color w:val="1A1A2E"/>
                 <w:sz w:val="18"/>
               </w:rPr>
-              <w:t>$72Kâ€“$180K</w:t>
+              <w:t>$72K-$180K</w:t>
             </w:r>
           </w:p>
         </w:tc>
@@ -3746,7 +3745,7 @@
                 <w:color w:val="1A1A2E"/>
                 <w:sz w:val="18"/>
               </w:rPr>
-              <w:t>$8Kâ€“$15K/mo</w:t>
+              <w:t>$8K-$15K/mo</w:t>
             </w:r>
           </w:p>
         </w:tc>
@@ -3780,7 +3779,7 @@
                 <w:color w:val="1A1A2E"/>
                 <w:sz w:val="18"/>
               </w:rPr>
-              <w:t>S4 (100â€“200)</w:t>
+              <w:t>S4 (100-200)</w:t>
             </w:r>
           </w:p>
         </w:tc>
@@ -3796,7 +3795,7 @@
                 <w:color w:val="1A1A2E"/>
                 <w:sz w:val="18"/>
               </w:rPr>
-              <w:t>$10Kâ€“$25K/mo</w:t>
+              <w:t>$10K-$25K/mo</w:t>
             </w:r>
           </w:p>
         </w:tc>
@@ -3812,7 +3811,7 @@
                 <w:color w:val="1A1A2E"/>
                 <w:sz w:val="18"/>
               </w:rPr>
-              <w:t>$120Kâ€“$300K</w:t>
+              <w:t>$120K-$300K</w:t>
             </w:r>
           </w:p>
         </w:tc>
@@ -3828,7 +3827,7 @@
                 <w:color w:val="1A1A2E"/>
                 <w:sz w:val="18"/>
               </w:rPr>
-              <w:t>$12Kâ€“$20K/mo</w:t>
+              <w:t>$12K-$20K/mo</w:t>
             </w:r>
           </w:p>
         </w:tc>
@@ -3844,7 +3843,7 @@
                 <w:color w:val="1A1A2E"/>
                 <w:sz w:val="18"/>
               </w:rPr>
-              <w:t>Series Bâ€“C / $10M+ ARR</w:t>
+              <w:t>Series B-C / $10M+ ARR</w:t>
             </w:r>
           </w:p>
         </w:tc>
@@ -3874,7 +3873,7 @@
           <w:color w:val="1A1A2E"/>
           <w:sz w:val="20"/>
         </w:rPr>
-        <w:t>ROI frame: "One new $5K/month client per month = $60K ARR. That pays for SELLL 10x in year one." (S1/S2 framing)</w:t>
+        <w:t>ROI frame (S1/S2): 'One new $5K/month client per month = $60K ARR. That pays for SELLL 10x in year one.'</w:t>
       </w:r>
     </w:p>
     <w:p>
@@ -4212,7 +4211,7 @@
                 <w:color w:val="1A1A2E"/>
                 <w:sz w:val="18"/>
               </w:rPr>
-              <w:t>Trust-builder, not a primary acquisition lever</w:t>
+              <w:t>Trust-builder; not a primary acquisition lever</w:t>
             </w:r>
           </w:p>
         </w:tc>
@@ -4229,7 +4228,7 @@
           <w:color w:val="1A1A2E"/>
           <w:sz w:val="20"/>
         </w:rPr>
-        <w:t>Cadence: Day 1 email â†’ Day 3 email â†’ Day 5 LinkedIn â†’ Day 7 email â†’ Day 10 LinkedIn DM â†’ Day 14 email â†’ Day 21 breakup.</w:t>
+        <w:t>Cadence: Day 1 email -&gt; Day 3 email -&gt; Day 5 LinkedIn -&gt; Day 7 email -&gt; Day 10 LinkedIn DM -&gt; Day 14 email -&gt; Day 21 breakup.</w:t>
       </w:r>
     </w:p>
     <w:p>
@@ -4245,7 +4244,7 @@
           <w:color w:val="E8B830"/>
           <w:sz w:val="24"/>
         </w:rPr>
-        <w:t>7. NEGATIVE ICP Â€” WHO NOT TO CHASE</w:t>
+        <w:t>7. NEGATIVE ICP - WHO NOT TO CHASE</w:t>
       </w:r>
     </w:p>
     <w:tbl>
@@ -4317,7 +4316,7 @@
                 <w:color w:val="FFFFFF"/>
                 <w:sz w:val="18"/>
               </w:rPr>
-              <w:t>Why</w:t>
+              <w:t>Why It Disqualifies</w:t>
             </w:r>
           </w:p>
         </w:tc>
@@ -4401,7 +4400,7 @@
                 <w:color w:val="1A1A2E"/>
                 <w:sz w:val="18"/>
               </w:rPr>
-              <w:t>Plans under $250/month visible on pricing</w:t>
+              <w:t>Plans under $250/month on pricing page</w:t>
             </w:r>
           </w:p>
         </w:tc>
@@ -4601,7 +4600,7 @@
                 <w:color w:val="1A1A2E"/>
                 <w:sz w:val="18"/>
               </w:rPr>
-              <w:t>No US ambitions</w:t>
+              <w:t>No US ambitions visible</w:t>
             </w:r>
           </w:p>
         </w:tc>
@@ -4717,7 +4716,7 @@
                 <w:color w:val="1A1A2E"/>
                 <w:sz w:val="18"/>
               </w:rPr>
-              <w:t>System can't run with manual review</w:t>
+              <w:t>System cannot run with manual review on every touchpoint</w:t>
             </w:r>
           </w:p>
         </w:tc>
@@ -4767,7 +4766,7 @@
                 <w:color w:val="1A1A2E"/>
                 <w:sz w:val="18"/>
               </w:rPr>
-              <w:t>Can't afford the retainer; churn at first slow month</w:t>
+              <w:t>Cannot afford the retainer; will churn at first slow month</w:t>
             </w:r>
           </w:p>
         </w:tc>
@@ -5185,7 +5184,7 @@
     <w:p/>
     <w:p>
       <w:pPr>
-        <w:spacing w:before="200" w:after="100"/>
+        <w:spacing w:before="200" w:after="80"/>
       </w:pPr>
       <w:r>
         <w:rPr>
@@ -5193,7 +5192,7 @@
           <w:color w:val="1A1A2E"/>
           <w:sz w:val="21"/>
         </w:rPr>
-        <w:t>Firmographic Fit â€” 25 points</w:t>
+        <w:t>Firmographic Fit - 25 points</w:t>
       </w:r>
     </w:p>
     <w:p>
@@ -5214,7 +5213,7 @@
           <w:color w:val="1A1A2E"/>
           <w:sz w:val="20"/>
         </w:rPr>
-        <w:t>B2B SaaS/services, 15â€“100 employees, $1Mâ€“$15M ARR, US/UK/CA/AUS, Series A+, hiring/funded</w:t>
+        <w:t>B2B SaaS/services, 15-100 employees, $1M-$15M ARR, US/UK/CA/AUS, Series A+, hiring/funded</w:t>
       </w:r>
     </w:p>
     <w:p>
@@ -5235,7 +5234,7 @@
           <w:color w:val="1A1A2E"/>
           <w:sz w:val="20"/>
         </w:rPr>
-        <w:t>Meets 4 of 5 firmographic criteria â€” slightly outside ideal range</w:t>
+        <w:t>Meets 4 of 5 firmographic criteria - slightly outside ideal range</w:t>
       </w:r>
     </w:p>
     <w:p>
@@ -5256,7 +5255,7 @@
           <w:color w:val="1A1A2E"/>
           <w:sz w:val="20"/>
         </w:rPr>
-        <w:t>Meets 3 of 5 â€” one significant gap</w:t>
+        <w:t>Meets 3 of 5 - one significant gap</w:t>
       </w:r>
     </w:p>
     <w:p>
@@ -5277,7 +5276,7 @@
           <w:color w:val="1A1A2E"/>
           <w:sz w:val="20"/>
         </w:rPr>
-        <w:t>Meets 1â€“2 criteria â€” marginal fit</w:t>
+        <w:t>Meets 1-2 criteria - marginal fit</w:t>
       </w:r>
     </w:p>
     <w:p>
@@ -5304,7 +5303,7 @@
     <w:p/>
     <w:p>
       <w:pPr>
-        <w:spacing w:before="200" w:after="100"/>
+        <w:spacing w:before="200" w:after="80"/>
       </w:pPr>
       <w:r>
         <w:rPr>
@@ -5312,7 +5311,7 @@
           <w:color w:val="1A1A2E"/>
           <w:sz w:val="21"/>
         </w:rPr>
-        <w:t>Technographic Fit â€” 15 points</w:t>
+        <w:t>Technographic Fit - 15 points</w:t>
       </w:r>
     </w:p>
     <w:p>
@@ -5423,7 +5422,7 @@
     <w:p/>
     <w:p>
       <w:pPr>
-        <w:spacing w:before="200" w:after="100"/>
+        <w:spacing w:before="200" w:after="80"/>
       </w:pPr>
       <w:r>
         <w:rPr>
@@ -5431,7 +5430,7 @@
           <w:color w:val="1A1A2E"/>
           <w:sz w:val="21"/>
         </w:rPr>
-        <w:t>Pain Point Alignment â€” 20 points</w:t>
+        <w:t>Pain Point Alignment - 20 points</w:t>
       </w:r>
     </w:p>
     <w:p>
@@ -5452,7 +5451,7 @@
           <w:color w:val="1A1A2E"/>
           <w:sz w:val="20"/>
         </w:rPr>
-        <w:t>Observable: founder posting about sales, hiring SDR, referral program, stalled growth</w:t>
+        <w:t>Observable: founder posting about sales, SDR hiring, referral program, stalled growth</w:t>
       </w:r>
     </w:p>
     <w:p>
@@ -5494,7 +5493,7 @@
           <w:color w:val="1A1A2E"/>
           <w:sz w:val="20"/>
         </w:rPr>
-        <w:t>Pain likely exists but no observable confirmation â€” needs discovery</w:t>
+        <w:t>Pain likely exists but no observable confirmation; needs discovery</w:t>
       </w:r>
     </w:p>
     <w:p>
@@ -5542,7 +5541,7 @@
     <w:p/>
     <w:p>
       <w:pPr>
-        <w:spacing w:before="200" w:after="100"/>
+        <w:spacing w:before="200" w:after="80"/>
       </w:pPr>
       <w:r>
         <w:rPr>
@@ -5550,7 +5549,7 @@
           <w:color w:val="1A1A2E"/>
           <w:sz w:val="21"/>
         </w:rPr>
-        <w:t>Budget Capacity â€” 20 points</w:t>
+        <w:t>Budget Capacity - 20 points</w:t>
       </w:r>
     </w:p>
     <w:p>
@@ -5661,7 +5660,7 @@
     <w:p/>
     <w:p>
       <w:pPr>
-        <w:spacing w:before="200" w:after="100"/>
+        <w:spacing w:before="200" w:after="80"/>
       </w:pPr>
       <w:r>
         <w:rPr>
@@ -5669,7 +5668,7 @@
           <w:color w:val="1A1A2E"/>
           <w:sz w:val="21"/>
         </w:rPr>
-        <w:t>Contact Access â€” 10 points</w:t>
+        <w:t>Contact Access - 10 points</w:t>
       </w:r>
     </w:p>
     <w:p>
@@ -5780,7 +5779,7 @@
     <w:p/>
     <w:p>
       <w:pPr>
-        <w:spacing w:before="200" w:after="100"/>
+        <w:spacing w:before="200" w:after="80"/>
       </w:pPr>
       <w:r>
         <w:rPr>
@@ -5788,7 +5787,7 @@
           <w:color w:val="1A1A2E"/>
           <w:sz w:val="21"/>
         </w:rPr>
-        <w:t>Timing Signals â€” 10 points</w:t>
+        <w:t>Timing Signals - 10 points</w:t>
       </w:r>
     </w:p>
     <w:p>
@@ -5809,7 +5808,7 @@
           <w:color w:val="1A1A2E"/>
           <w:sz w:val="20"/>
         </w:rPr>
-        <w:t>Active hiring + funding in last 6 months + urgency indicator (founder post, new exec, PH launch)</w:t>
+        <w:t>Active hiring + funding last 6 months + urgency indicator (founder post, new exec, PH launch)</w:t>
       </w:r>
     </w:p>
     <w:p>
@@ -5851,7 +5850,7 @@
           <w:color w:val="1A1A2E"/>
           <w:sz w:val="20"/>
         </w:rPr>
-        <w:t>Steady state â€” profile fits but no urgency trigger</w:t>
+        <w:t>Steady state - profile fits but no urgency trigger</w:t>
       </w:r>
     </w:p>
     <w:p>
@@ -5872,7 +5871,7 @@
           <w:color w:val="1A1A2E"/>
           <w:sz w:val="20"/>
         </w:rPr>
-        <w:t>Cold account â€” no recent signals</w:t>
+        <w:t>Cold account - no recent signals</w:t>
       </w:r>
     </w:p>
     <w:p>
@@ -5899,7 +5898,7 @@
     <w:p/>
     <w:p>
       <w:pPr>
-        <w:spacing w:before="200" w:after="100"/>
+        <w:spacing w:before="200" w:after="80"/>
       </w:pPr>
       <w:r>
         <w:rPr>
@@ -6013,7 +6012,7 @@
                 <w:color w:val="1A1A2E"/>
                 <w:sz w:val="18"/>
               </w:rPr>
-              <w:t>90â€“100</w:t>
+              <w:t>90-100</w:t>
             </w:r>
           </w:p>
         </w:tc>
@@ -6063,7 +6062,7 @@
                 <w:color w:val="1A1A2E"/>
                 <w:sz w:val="18"/>
               </w:rPr>
-              <w:t>75â€“89</w:t>
+              <w:t>75-89</w:t>
             </w:r>
           </w:p>
         </w:tc>
@@ -6113,7 +6112,7 @@
                 <w:color w:val="1A1A2E"/>
                 <w:sz w:val="18"/>
               </w:rPr>
-              <w:t>60â€“74</w:t>
+              <w:t>60-74</w:t>
             </w:r>
           </w:p>
         </w:tc>
@@ -6163,7 +6162,7 @@
                 <w:color w:val="1A1A2E"/>
                 <w:sz w:val="18"/>
               </w:rPr>
-              <w:t>40â€“59</w:t>
+              <w:t>40-59</w:t>
             </w:r>
           </w:p>
         </w:tc>
@@ -6213,7 +6212,7 @@
                 <w:color w:val="1A1A2E"/>
                 <w:sz w:val="18"/>
               </w:rPr>
-              <w:t>0â€“39</w:t>
+              <w:t>0-39</w:t>
             </w:r>
           </w:p>
         </w:tc>
@@ -6238,7 +6237,7 @@
     <w:p/>
     <w:p>
       <w:pPr>
-        <w:spacing w:before="200" w:after="100"/>
+        <w:spacing w:before="200" w:after="80"/>
       </w:pPr>
       <w:r>
         <w:rPr>
@@ -6272,7 +6271,7 @@
           <w:color w:val="1A1A2E"/>
           <w:sz w:val="20"/>
         </w:rPr>
-        <w:t>Do they have 10â€“200 employees with no full RevOps team? (Y/N)</w:t>
+        <w:t>Do they have 10-200 employees with no full RevOps team? (Y/N)</w:t>
       </w:r>
     </w:p>
     <w:p>
@@ -6324,7 +6323,7 @@
           <w:color w:val="1A1A2E"/>
           <w:sz w:val="20"/>
         </w:rPr>
-        <w:t>5 Yes = A Â· 3â€“4 Yes = B Â· 1â€“2 Yes = C Â· 0 Yes = D</w:t>
+        <w:t>5 Yes = A  |  3-4 Yes = B  |  1-2 Yes = C  |  0 Yes = D</w:t>
       </w:r>
     </w:p>
     <w:p>
@@ -6345,7 +6344,7 @@
     </w:p>
     <w:p>
       <w:pPr>
-        <w:spacing w:before="200" w:after="100"/>
+        <w:spacing w:before="200" w:after="80"/>
       </w:pPr>
       <w:r>
         <w:rPr>
@@ -6353,7 +6352,7 @@
           <w:color w:val="1A1A2E"/>
           <w:sz w:val="21"/>
         </w:rPr>
-        <w:t>Persona 1 â€” 'The Burning Founder'</w:t>
+        <w:t>Persona 1 - 'The Burning Founder'</w:t>
       </w:r>
     </w:p>
     <w:p>
@@ -6366,12 +6365,12 @@
           <w:color w:val="1A1A2E"/>
           <w:sz w:val="20"/>
         </w:rPr>
-        <w:t>Segments: S1â€“S2</w:t>
+        <w:t>Segments: Segments S1-S2</w:t>
       </w:r>
     </w:p>
     <w:p>
       <w:pPr>
-        <w:spacing w:before="200" w:after="100"/>
+        <w:spacing w:before="200" w:after="80"/>
       </w:pPr>
       <w:r>
         <w:rPr>
@@ -6392,12 +6391,12 @@
           <w:color w:val="1A1A2E"/>
           <w:sz w:val="20"/>
         </w:rPr>
-        <w:t>CEO / Co-Founder, 28â€“42, technical or product background, no formal sales training. 6â€“30 people. Raised Seed or Series A 6â€“24 months ago. 3â€“15 paying customers, all from personal network. Spends 40% of time selling, hates it, can't stop.</w:t>
+        <w:t>CEO / Co-Founder, 28-42, technical or product background, no formal sales training. 6-30 people. Raised Seed or Series A 6-24 months ago. 3-15 paying customers, all from personal network. Spends 40% of time selling, hates it, cannot stop.</w:t>
       </w:r>
     </w:p>
     <w:p>
       <w:pPr>
-        <w:spacing w:before="200" w:after="100"/>
+        <w:spacing w:before="200" w:after="80"/>
       </w:pPr>
       <w:r>
         <w:rPr>
@@ -6423,7 +6422,7 @@
     </w:p>
     <w:p>
       <w:pPr>
-        <w:spacing w:before="200" w:after="100"/>
+        <w:spacing w:before="200" w:after="80"/>
       </w:pPr>
       <w:r>
         <w:rPr>
@@ -6488,7 +6487,7 @@
     </w:p>
     <w:p>
       <w:pPr>
-        <w:spacing w:before="200" w:after="100"/>
+        <w:spacing w:before="200" w:after="80"/>
       </w:pPr>
       <w:r>
         <w:rPr>
@@ -6514,7 +6513,7 @@
     </w:p>
     <w:p>
       <w:pPr>
-        <w:spacing w:before="200" w:after="100"/>
+        <w:spacing w:before="200" w:after="80"/>
       </w:pPr>
       <w:r>
         <w:rPr>
@@ -6641,7 +6640,7 @@
                 <w:color w:val="1A1A2E"/>
                 <w:sz w:val="18"/>
               </w:rPr>
-              <w:t>'The ICP phase IS your positioning exercise. You'll know more after 3 weeks of outbound than 3 months of strategy.'</w:t>
+              <w:t>'The ICP phase IS your positioning exercise. You will know more after 3 weeks of outbound than 3 months of strategy.'</w:t>
             </w:r>
           </w:p>
         </w:tc>
@@ -6684,7 +6683,7 @@
     <w:p/>
     <w:p>
       <w:pPr>
-        <w:spacing w:before="200" w:after="100"/>
+        <w:spacing w:before="200" w:after="80"/>
       </w:pPr>
       <w:r>
         <w:rPr>
@@ -6709,7 +6708,6 @@
       </w:r>
       <w:r>
         <w:rPr>
-          <w:i/>
           <w:sz w:val="20"/>
         </w:rPr>
         <w:t>after founder-led sales hits its ceiling</w:t>
@@ -6732,12 +6730,12 @@
           <w:i/>
           <w:sz w:val="20"/>
         </w:rPr>
-        <w:t>Most founders at your stage close 60â€“70% of their own deals. The problem is there's a hard limit on how many deals one person can run.</w:t>
+        <w:t>Most founders at your stage close 60-70% of their own deals. The problem is there is a hard limit on how many deals one person can run.</w:t>
       </w:r>
     </w:p>
     <w:p>
       <w:pPr>
-        <w:spacing w:before="200" w:after="100"/>
+        <w:spacing w:before="200" w:after="80"/>
       </w:pPr>
       <w:r>
         <w:rPr>
@@ -6745,7 +6743,7 @@
           <w:color w:val="1A1A2E"/>
           <w:sz w:val="21"/>
         </w:rPr>
-        <w:t>Persona 2 â€” 'The Transition Founder'</w:t>
+        <w:t>Persona 2 - 'The Transition Founder'</w:t>
       </w:r>
     </w:p>
     <w:p>
@@ -6758,12 +6756,12 @@
           <w:color w:val="1A1A2E"/>
           <w:sz w:val="20"/>
         </w:rPr>
-        <w:t>Segments: S2 â€” Best Fit</w:t>
+        <w:t>Segments: Segment S2 - BEST FIT</w:t>
       </w:r>
     </w:p>
     <w:p>
       <w:pPr>
-        <w:spacing w:before="200" w:after="100"/>
+        <w:spacing w:before="200" w:after="80"/>
       </w:pPr>
       <w:r>
         <w:rPr>
@@ -6784,12 +6782,12 @@
           <w:color w:val="1A1A2E"/>
           <w:sz w:val="20"/>
         </w:rPr>
-        <w:t>CEO / Co-Founder, 32â€“48, running the company 3â€“6 years. $1Mâ€“$5M ARR. 15â€“50 people. Has tried one or two salespeople â€” both underperformed vs the founder's close rate. Evaluating: hire a VP Sales, outsource, or build the system.</w:t>
+        <w:t>CEO / Co-Founder, 32-48, running the company 3-6 years. $1M-$5M ARR. 15-50 people. Has tried one or two salespeople - both underperformed vs the founder's close rate. Now evaluating: hire a VP Sales, outsource, or build the system.</w:t>
       </w:r>
     </w:p>
     <w:p>
       <w:pPr>
-        <w:spacing w:before="200" w:after="100"/>
+        <w:spacing w:before="200" w:after="80"/>
       </w:pPr>
       <w:r>
         <w:rPr>
@@ -6810,12 +6808,12 @@
           <w:color w:val="1A1A2E"/>
           <w:sz w:val="20"/>
         </w:rPr>
-        <w:t>Get to $3Mâ€“$10M ARR. Remove themselves from the sales process. Build something that runs without them.</w:t>
+        <w:t>Get to $3M-$10M ARR. Remove themselves from the sales process. Build something that runs without them.</w:t>
       </w:r>
     </w:p>
     <w:p>
       <w:pPr>
-        <w:spacing w:before="200" w:after="100"/>
+        <w:spacing w:before="200" w:after="80"/>
       </w:pPr>
       <w:r>
         <w:rPr>
@@ -6880,7 +6878,7 @@
     </w:p>
     <w:p>
       <w:pPr>
-        <w:spacing w:before="200" w:after="100"/>
+        <w:spacing w:before="200" w:after="80"/>
       </w:pPr>
       <w:r>
         <w:rPr>
@@ -6906,7 +6904,7 @@
     </w:p>
     <w:p>
       <w:pPr>
-        <w:spacing w:before="200" w:after="100"/>
+        <w:spacing w:before="200" w:after="80"/>
       </w:pPr>
       <w:r>
         <w:rPr>
@@ -6983,7 +6981,7 @@
                 <w:color w:val="1A1A2E"/>
                 <w:sz w:val="18"/>
               </w:rPr>
-              <w:t>"We tried an agency before â€” it didn't work"</w:t>
+              <w:t>"We tried an agency before - it didn't work"</w:t>
             </w:r>
           </w:p>
         </w:tc>
@@ -6999,7 +6997,7 @@
                 <w:color w:val="1A1A2E"/>
                 <w:sz w:val="18"/>
               </w:rPr>
-              <w:t>'What specifically broke â€” the list, the message, or the follow-through? Our system addresses all three. Let me show you what we'd audit from your last attempt.'</w:t>
+              <w:t>'What specifically broke - the list, the message, or the follow-through? Our system addresses all three. Let me show you what we would audit from your last attempt.'</w:t>
             </w:r>
           </w:p>
         </w:tc>
@@ -7017,7 +7015,7 @@
                 <w:color w:val="1A1A2E"/>
                 <w:sz w:val="18"/>
               </w:rPr>
-              <w:t>"Only I can sell this â€” I know the product too well"</w:t>
+              <w:t>"Only I can sell this - I know the product too well"</w:t>
             </w:r>
           </w:p>
         </w:tc>
@@ -7033,7 +7031,7 @@
                 <w:color w:val="1A1A2E"/>
                 <w:sz w:val="18"/>
               </w:rPr>
-              <w:t>'That's exactly why it hasn't scaled. We encode what you know into a system that runs without you.'</w:t>
+              <w:t>'That is exactly why it hasn't scaled. We encode what you know into a system that runs without you.'</w:t>
             </w:r>
           </w:p>
         </w:tc>
@@ -7067,7 +7065,7 @@
                 <w:color w:val="1A1A2E"/>
                 <w:sz w:val="18"/>
               </w:rPr>
-              <w:t>'If you're closing deals today â€” even 2 per month â€” you're ready. Waiting for readiness costs you the quarters in between.'</w:t>
+              <w:t>'If you're closing deals today - even 2 per month - you're ready. Waiting for readiness costs you the quarters in between.'</w:t>
             </w:r>
           </w:p>
         </w:tc>
@@ -7076,7 +7074,7 @@
     <w:p/>
     <w:p>
       <w:pPr>
-        <w:spacing w:before="200" w:after="100"/>
+        <w:spacing w:before="200" w:after="80"/>
       </w:pPr>
       <w:r>
         <w:rPr>
@@ -7101,10 +7099,9 @@
       </w:r>
       <w:r>
         <w:rPr>
-          <w:i/>
           <w:sz w:val="20"/>
         </w:rPr>
-        <w:t>the $3Mâ€“$10M ARR wall</w:t>
+        <w:t>the $3M-$10M ARR wall</w:t>
       </w:r>
     </w:p>
     <w:p>
@@ -7124,12 +7121,12 @@
           <w:i/>
           <w:sz w:val="20"/>
         </w:rPr>
-        <w:t>Most founders hit a ceiling at exactly your stage â€” not because the product isn't great, but because there's no system behind the revenue that doesn't depend on you being in the room.</w:t>
+        <w:t>Most founders hit a ceiling at exactly your stage - not because the product isn't great, but because there is no system behind the revenue that doesn't depend on you being in the room.</w:t>
       </w:r>
     </w:p>
     <w:p>
       <w:pPr>
-        <w:spacing w:before="200" w:after="100"/>
+        <w:spacing w:before="200" w:after="80"/>
       </w:pPr>
       <w:r>
         <w:rPr>
@@ -7137,7 +7134,7 @@
           <w:color w:val="1A1A2E"/>
           <w:sz w:val="21"/>
         </w:rPr>
-        <w:t>Persona 3 â€” 'The Revenue Leader Under Pressure'</w:t>
+        <w:t>Persona 3 - 'The Revenue Leader Under Pressure'</w:t>
       </w:r>
     </w:p>
     <w:p>
@@ -7150,12 +7147,12 @@
           <w:color w:val="1A1A2E"/>
           <w:sz w:val="20"/>
         </w:rPr>
-        <w:t>Segments: S3â€“S4</w:t>
+        <w:t>Segments: Segments S3-S4</w:t>
       </w:r>
     </w:p>
     <w:p>
       <w:pPr>
-        <w:spacing w:before="200" w:after="100"/>
+        <w:spacing w:before="200" w:after="80"/>
       </w:pPr>
       <w:r>
         <w:rPr>
@@ -7176,12 +7173,12 @@
           <w:color w:val="1A1A2E"/>
           <w:sz w:val="20"/>
         </w:rPr>
-        <w:t>VP Sales / CRO / Head of Revenue, 35â€“52, professional sales background. Managing 3â€“15 reps. Pipeline inconsistent. Board is asking questions. Has tried to fix sequence strategy internally, hasn't moved the needle. May be newly hired in last 90 days.</w:t>
+        <w:t>VP Sales / CRO / Head of Revenue, 35-52, professional sales background. Managing 3-15 reps. Pipeline inconsistent. Board is asking questions. Has tried to fix sequence strategy internally, has not moved the needle. May be newly hired in last 90 days.</w:t>
       </w:r>
     </w:p>
     <w:p>
       <w:pPr>
-        <w:spacing w:before="200" w:after="100"/>
+        <w:spacing w:before="200" w:after="80"/>
       </w:pPr>
       <w:r>
         <w:rPr>
@@ -7207,7 +7204,7 @@
     </w:p>
     <w:p>
       <w:pPr>
-        <w:spacing w:before="200" w:after="100"/>
+        <w:spacing w:before="200" w:after="80"/>
       </w:pPr>
       <w:r>
         <w:rPr>
@@ -7267,12 +7264,12 @@
           <w:color w:val="1A1A2E"/>
           <w:sz w:val="20"/>
         </w:rPr>
-        <w:t>"The board wants to see 2x pipeline â€” I need to show them a plan"</w:t>
+        <w:t>"The board wants to see 2x pipeline - I need to show them a plan"</w:t>
       </w:r>
     </w:p>
     <w:p>
       <w:pPr>
-        <w:spacing w:before="200" w:after="100"/>
+        <w:spacing w:before="200" w:after="80"/>
       </w:pPr>
       <w:r>
         <w:rPr>
@@ -7298,7 +7295,7 @@
     </w:p>
     <w:p>
       <w:pPr>
-        <w:spacing w:before="200" w:after="100"/>
+        <w:spacing w:before="200" w:after="80"/>
       </w:pPr>
       <w:r>
         <w:rPr>
@@ -7391,7 +7388,7 @@
                 <w:color w:val="1A1A2E"/>
                 <w:sz w:val="18"/>
               </w:rPr>
-              <w:t>'Those are execution tools. What we build is the intelligence layer above them â€” the signal model that tells your reps who to call today and why.'</w:t>
+              <w:t>'Those are execution tools. What we build is the intelligence layer above them - the signal model that tells your reps who to call today and why.'</w:t>
             </w:r>
           </w:p>
         </w:tc>
@@ -7425,7 +7422,7 @@
                 <w:color w:val="1A1A2E"/>
                 <w:sz w:val="18"/>
               </w:rPr>
-              <w:t>'They should be â€” and they will be, once the system exists. Right now they're building lists instead of having conversations.'</w:t>
+              <w:t>'They should be - and they will be, once the system exists. Right now they are building lists instead of having conversations.'</w:t>
             </w:r>
           </w:p>
         </w:tc>
@@ -7459,7 +7456,7 @@
                 <w:color w:val="1A1A2E"/>
                 <w:sz w:val="18"/>
               </w:rPr>
-              <w:t>'We'd expect that. What would a successful 90-day build look like for you specifically?'</w:t>
+              <w:t>'We would expect that. What would a successful 90-day build look like for you specifically?'</w:t>
             </w:r>
           </w:p>
         </w:tc>
@@ -7468,7 +7465,7 @@
     <w:p/>
     <w:p>
       <w:pPr>
-        <w:spacing w:before="200" w:after="100"/>
+        <w:spacing w:before="200" w:after="80"/>
       </w:pPr>
       <w:r>
         <w:rPr>
@@ -7493,7 +7490,6 @@
       </w:r>
       <w:r>
         <w:rPr>
-          <w:i/>
           <w:sz w:val="20"/>
         </w:rPr>
         <w:t>your SDRs aren't the problem</w:t>
@@ -7516,7 +7512,7 @@
           <w:i/>
           <w:sz w:val="20"/>
         </w:rPr>
-        <w:t>Your team is probably doing everything right â€” they're just spending 40% of their time building lists instead of talking to buyers.</w:t>
+        <w:t>Your team is probably doing everything right - they are just spending 40% of their time building lists instead of talking to buyers.</w:t>
       </w:r>
     </w:p>
     <w:p>
@@ -7537,7 +7533,7 @@
     </w:p>
     <w:p>
       <w:pPr>
-        <w:spacing w:before="200" w:after="100"/>
+        <w:spacing w:before="200" w:after="80"/>
       </w:pPr>
       <w:r>
         <w:rPr>
@@ -7550,7 +7546,7 @@
     </w:p>
     <w:p>
       <w:pPr>
-        <w:spacing w:before="200" w:after="100"/>
+        <w:spacing w:before="200" w:after="80"/>
       </w:pPr>
       <w:r>
         <w:rPr>
@@ -7558,7 +7554,7 @@
           <w:color w:val="1A1A2E"/>
           <w:sz w:val="21"/>
         </w:rPr>
-        <w:t>Signal A â€” SDR / Sales Hiring (highest urgency)</w:t>
+        <w:t>Signal A - SDR / Sales Hiring (highest urgency)</w:t>
       </w:r>
     </w:p>
     <w:p>
@@ -7571,7 +7567,7 @@
           <w:color w:val="1A1A2E"/>
           <w:sz w:val="20"/>
         </w:rPr>
-        <w:t>LinkedIn Jobs: "sales development representative" "SaaS" United States + Company size: 11â€“200</w:t>
+        <w:t>LinkedIn Jobs: "sales development representative" "SaaS" United States + Company size: 11-200</w:t>
       </w:r>
     </w:p>
     <w:p>
@@ -7584,7 +7580,7 @@
           <w:color w:val="1A1A2E"/>
           <w:sz w:val="20"/>
         </w:rPr>
-        <w:t>LinkedIn Jobs: "VP Sales" OR "Head of Revenue" "startup" + Company size: 11â€“200</w:t>
+        <w:t>LinkedIn Jobs: "VP Sales" OR "Head of Revenue" "startup" + Company size: 11-200</w:t>
       </w:r>
     </w:p>
     <w:p>
@@ -7597,12 +7593,12 @@
           <w:color w:val="1A1A2E"/>
           <w:sz w:val="20"/>
         </w:rPr>
-        <w:t>Apollo.io: Job title = SDR/BDR, recently posted, company size 10â€“200</w:t>
+        <w:t>Apollo.io: Job title = SDR/BDR, recently posted, company size 10-200</w:t>
       </w:r>
     </w:p>
     <w:p>
       <w:pPr>
-        <w:spacing w:before="200" w:after="100"/>
+        <w:spacing w:before="200" w:after="80"/>
       </w:pPr>
       <w:r>
         <w:rPr>
@@ -7610,7 +7606,7 @@
           <w:color w:val="1A1A2E"/>
           <w:sz w:val="21"/>
         </w:rPr>
-        <w:t>Signal B â€” ProductHunt Launch (B2B, last 60 days)</w:t>
+        <w:t>Signal B - ProductHunt Launch (B2B, last 60 days)</w:t>
       </w:r>
     </w:p>
     <w:p>
@@ -7623,7 +7619,7 @@
           <w:color w:val="1A1A2E"/>
           <w:sz w:val="20"/>
         </w:rPr>
-        <w:t>producthunt.com/topics/business-tools â†’ filter last 60 days â†’ B2B only â†’ 100+ upvotes</w:t>
+        <w:t>producthunt.com/topics/business-tools - filter last 60 days, B2B only, 100+ upvotes</w:t>
       </w:r>
     </w:p>
     <w:p>
@@ -7641,7 +7637,7 @@
     </w:p>
     <w:p>
       <w:pPr>
-        <w:spacing w:before="200" w:after="100"/>
+        <w:spacing w:before="200" w:after="80"/>
       </w:pPr>
       <w:r>
         <w:rPr>
@@ -7649,7 +7645,7 @@
           <w:color w:val="1A1A2E"/>
           <w:sz w:val="21"/>
         </w:rPr>
-        <w:t>Signal C â€” New VP Sales / CRO (&lt; 60 days in role)</w:t>
+        <w:t>Signal C - New VP Sales / CRO (under 60 days in role)</w:t>
       </w:r>
     </w:p>
     <w:p>
@@ -7662,7 +7658,7 @@
           <w:color w:val="1A1A2E"/>
           <w:sz w:val="20"/>
         </w:rPr>
-        <w:t>Apollo: Job change filter â†’ VP Sales / CRO â†’ Software â†’ 11â€“200 employees â†’ last 90 days</w:t>
+        <w:t>Apollo: Job change filter -&gt; VP Sales / CRO -&gt; Software -&gt; 11-200 employees -&gt; last 90 days</w:t>
       </w:r>
     </w:p>
     <w:p>
@@ -7675,12 +7671,12 @@
           <w:color w:val="1A1A2E"/>
           <w:sz w:val="20"/>
         </w:rPr>
-        <w:t>LinkedIn: 'Started new position' + 'VP Sales' â†’ filter by industry and size</w:t>
+        <w:t>LinkedIn: 'Started new position' + 'VP Sales' -&gt; filter by industry and size</w:t>
       </w:r>
     </w:p>
     <w:p>
       <w:pPr>
-        <w:spacing w:before="200" w:after="100"/>
+        <w:spacing w:before="200" w:after="80"/>
       </w:pPr>
       <w:r>
         <w:rPr>
@@ -7688,7 +7684,7 @@
           <w:color w:val="1A1A2E"/>
           <w:sz w:val="21"/>
         </w:rPr>
-        <w:t>Signal D â€” Recently Funded</w:t>
+        <w:t>Signal D - Recently Funded</w:t>
       </w:r>
     </w:p>
     <w:p>
@@ -7701,7 +7697,7 @@
           <w:color w:val="1A1A2E"/>
           <w:sz w:val="20"/>
         </w:rPr>
-        <w:t>Crunchbase: Seed / Series A â†’ last 90 days â†’ B2B SaaS â†’ US/UK â†’ 10â€“100 employees</w:t>
+        <w:t>Crunchbase: Seed / Series A -&gt; last 90 days -&gt; B2B SaaS -&gt; US/UK -&gt; 10-100 employees</w:t>
       </w:r>
     </w:p>
     <w:p>
@@ -7719,7 +7715,7 @@
     </w:p>
     <w:p>
       <w:pPr>
-        <w:spacing w:before="200" w:after="100"/>
+        <w:spacing w:before="200" w:after="80"/>
       </w:pPr>
       <w:r>
         <w:rPr>
@@ -7779,7 +7775,7 @@
           <w:color w:val="1A1A2E"/>
           <w:sz w:val="20"/>
         </w:rPr>
-        <w:t>Email found and verified (Hunter.io â‰¥ 70% confidence)</w:t>
+        <w:t>Email found and verified (Hunter.io 70%+ confidence)</w:t>
       </w:r>
     </w:p>
     <w:p>
@@ -7792,7 +7788,7 @@
           <w:color w:val="1A1A2E"/>
           <w:sz w:val="20"/>
         </w:rPr>
-        <w:t>LinkedIn profile reviewed â€” active in last 30 days?</w:t>
+        <w:t>LinkedIn profile reviewed - active in last 30 days?</w:t>
       </w:r>
     </w:p>
     <w:p>
@@ -7805,7 +7801,7 @@
           <w:color w:val="1A1A2E"/>
           <w:sz w:val="20"/>
         </w:rPr>
-        <w:t>Trigger event confirmed (specific signal)</w:t>
+        <w:t>Trigger event confirmed (the specific signal that puts them on the list)</w:t>
       </w:r>
     </w:p>
     <w:p>
@@ -7818,7 +7814,7 @@
           <w:color w:val="1A1A2E"/>
           <w:sz w:val="20"/>
         </w:rPr>
-        <w:t>ACV estimated (pricing page, G2 reviews, job post salary hints)</w:t>
+        <w:t>ACV estimated (pricing page, G2 reviews, or job post salary hints)</w:t>
       </w:r>
     </w:p>
     <w:p>
@@ -7857,12 +7853,12 @@
           <w:color w:val="1A1A2E"/>
           <w:sz w:val="20"/>
         </w:rPr>
-        <w:t>One personalisation anchor identified (specific post, news, product)</w:t>
+        <w:t>One personalisation anchor identified (post, news, product, job)</w:t>
       </w:r>
     </w:p>
     <w:p>
       <w:pPr>
-        <w:spacing w:before="200" w:after="100"/>
+        <w:spacing w:before="200" w:after="80"/>
       </w:pPr>
       <w:r>
         <w:rPr>
@@ -7883,7 +7879,7 @@
           <w:color w:val="1A1A2E"/>
           <w:sz w:val="20"/>
         </w:rPr>
-        <w:t>Consumer or B2C? â†’ If yes, disqualify immediately.</w:t>
+        <w:t>Consumer or B2C? -&gt; If yes, disqualify immediately.</w:t>
       </w:r>
     </w:p>
     <w:p>
@@ -7896,7 +7892,7 @@
           <w:color w:val="1A1A2E"/>
           <w:sz w:val="20"/>
         </w:rPr>
-        <w:t>ACV below $3K? â†’ If yes, economics don't work.</w:t>
+        <w:t>ACV below $3K? -&gt; If yes, economics don't work.</w:t>
       </w:r>
     </w:p>
     <w:p>
@@ -7909,7 +7905,7 @@
           <w:color w:val="1A1A2E"/>
           <w:sz w:val="20"/>
         </w:rPr>
-        <w:t>Full RevOps stack? â†’ If yes, wrong motion.</w:t>
+        <w:t>Full RevOps stack? -&gt; If yes, wrong motion.</w:t>
       </w:r>
     </w:p>
     <w:p>
@@ -8084,7 +8080,7 @@
                 <w:color w:val="1A1A2E"/>
                 <w:sz w:val="18"/>
               </w:rPr>
-              <w:t>SELLL builds the intelligence layer above sequences â€” signals, not just sends</w:t>
+              <w:t>SELLL builds the intelligence layer above sequences - signals, not just sends</w:t>
             </w:r>
           </w:p>
         </w:tc>
@@ -8184,7 +8180,7 @@
                 <w:color w:val="1A1A2E"/>
                 <w:sz w:val="18"/>
               </w:rPr>
-              <w:t>B2B SaaS, $15Kâ€“$40K/mo</w:t>
+              <w:t>B2B SaaS, $15K-$40K/mo</w:t>
             </w:r>
           </w:p>
         </w:tc>
@@ -8366,7 +8362,7 @@
           <w:color w:val="E8B830"/>
           <w:sz w:val="22"/>
         </w:rPr>
-        <w:t>"Other agencies write your emails. We build the system that knows who to send them to, when, and why â€” so every touchpoint is triggered by a signal, not a calendar."</w:t>
+        <w:t>"Other agencies write your emails. We build the system that knows who to send them to, when, and why - so every touchpoint is triggered by a signal, not a calendar."</w:t>
       </w:r>
     </w:p>
     <w:p>
@@ -8395,7 +8391,7 @@
           <w:color w:val="1A1A2E"/>
           <w:sz w:val="20"/>
         </w:rPr>
-        <w:t>You close 3+ deals from a segment outside these parameters â†’ update scoring weights</w:t>
+        <w:t>You close 3+ deals from a segment outside these parameters -&gt; update scoring weights</w:t>
       </w:r>
     </w:p>
     <w:p>
@@ -8408,7 +8404,7 @@
           <w:color w:val="1A1A2E"/>
           <w:sz w:val="20"/>
         </w:rPr>
-        <w:t>You lose 3+ deals to the same objection â†’ update pain point map and messaging</w:t>
+        <w:t>You lose 3+ deals to the same objection -&gt; update pain point map and messaging</w:t>
       </w:r>
     </w:p>
     <w:p>
@@ -8421,7 +8417,7 @@
           <w:color w:val="1A1A2E"/>
           <w:sz w:val="20"/>
         </w:rPr>
-        <w:t>SELLL adds a new service or delivery model â†’ update technographic fit criteria</w:t>
+        <w:t>SELLL adds a new service or delivery model -&gt; update technographic fit criteria</w:t>
       </w:r>
     </w:p>
     <w:p>
@@ -8434,7 +8430,7 @@
           <w:color w:val="1A1A2E"/>
           <w:sz w:val="20"/>
         </w:rPr>
-        <w:t>A major competitor changes pricing or targeting â†’ update competitive section</w:t>
+        <w:t>A major competitor changes pricing or targeting -&gt; update competitive section</w:t>
       </w:r>
     </w:p>
     <w:p>
@@ -8447,7 +8443,7 @@
           <w:color w:val="1A1A2E"/>
           <w:sz w:val="20"/>
         </w:rPr>
-        <w:t>Reply rates drop across all segments â†’ signal the ICP targeting has drifted</w:t>
+        <w:t>Reply rates drop across all segments -&gt; ICP targeting has drifted</w:t>
       </w:r>
     </w:p>
     <w:p>
@@ -8474,7 +8470,7 @@
           <w:color w:val="888888"/>
           <w:sz w:val="16"/>
         </w:rPr>
-        <w:t>SELLL Revenue Engine  Â·  Ideal Customer Profile  Â·  June 2026  Â·  Ophir Gold Edition</w:t>
+        <w:t>SELLL Revenue Engine  |  Ideal Customer Profile  |  June 2026  |  Ophir Gold Edition</w:t>
       </w:r>
     </w:p>
     <w:sectPr>

</xml_diff>